<commit_message>
03/03/2026 - Documentación añadido
Agregado de documentación diaria sobre el trabajo realizado sobre el TFG
</commit_message>
<xml_diff>
--- a/eco_woods/Documentacion/03_03_2026.docx
+++ b/eco_woods/Documentacion/03_03_2026.docx
@@ -2,7 +2,686 @@
 <file path=word/document.xml><?xml version="1.0" encoding="utf-8"?>
 <w:document xmlns:wpc="http://schemas.microsoft.com/office/word/2010/wordprocessingCanvas" xmlns:cx="http://schemas.microsoft.com/office/drawing/2014/chartex" xmlns:cx1="http://schemas.microsoft.com/office/drawing/2015/9/8/chartex" xmlns:cx2="http://schemas.microsoft.com/office/drawing/2015/10/21/chartex" xmlns:cx3="http://schemas.microsoft.com/office/drawing/2016/5/9/chartex" xmlns:cx4="http://schemas.microsoft.com/office/drawing/2016/5/10/chartex" xmlns:cx5="http://schemas.microsoft.com/office/drawing/2016/5/11/chartex" xmlns:cx6="http://schemas.microsoft.com/office/drawing/2016/5/12/chartex" xmlns:cx7="http://schemas.microsoft.com/office/drawing/2016/5/13/chartex" xmlns:cx8="http://schemas.microsoft.com/office/drawing/2016/5/14/chartex" xmlns:mc="http://schemas.openxmlformats.org/markup-compatibility/2006" xmlns:aink="http://schemas.microsoft.com/office/drawing/2016/ink" xmlns:am3d="http://schemas.microsoft.com/office/drawing/2017/model3d" xmlns:o="urn:schemas-microsoft-com:office:office" xmlns:oel="http://schemas.microsoft.com/office/2019/extlst" xmlns:r="http://schemas.openxmlformats.org/officeDocument/2006/relationships" xmlns:m="http://schemas.openxmlformats.org/officeDocument/2006/math" xmlns:v="urn:schemas-microsoft-com:vml" xmlns:wp14="http://schemas.microsoft.com/office/word/2010/wordprocessingDrawing" xmlns:wp="http://schemas.openxmlformats.org/drawingml/2006/wordprocessingDrawing" xmlns:w10="urn:schemas-microsoft-com:office:word" xmlns:w="http://schemas.openxmlformats.org/wordprocessingml/2006/main" xmlns:w14="http://schemas.microsoft.com/office/word/2010/wordml" xmlns:w15="http://schemas.microsoft.com/office/word/2012/wordml" xmlns:w16cex="http://schemas.microsoft.com/office/word/2018/wordml/cex" xmlns:w16cid="http://schemas.microsoft.com/office/word/2016/wordml/cid" xmlns:w16="http://schemas.microsoft.com/office/word/2018/wordml" xmlns:w16du="http://schemas.microsoft.com/office/word/2023/wordml/word16du" xmlns:w16sdtdh="http://schemas.microsoft.com/office/word/2020/wordml/sdtdatahash" xmlns:w16sdtfl="http://schemas.microsoft.com/office/word/2024/wordml/sdtformatlock" xmlns:w16se="http://schemas.microsoft.com/office/word/2015/wordml/symex" xmlns:wpg="http://schemas.microsoft.com/office/word/2010/wordprocessingGroup" xmlns:wpi="http://schemas.microsoft.com/office/word/2010/wordprocessingInk" xmlns:wne="http://schemas.microsoft.com/office/word/2006/wordml" xmlns:wps="http://schemas.microsoft.com/office/word/2010/wordprocessingShape" mc:Ignorable="w14 w15 w16se w16cid w16 w16cex w16sdtdh w16sdtfl w16du wp14">
   <w:body>
-    <w:p/>
+    <w:p>
+      <w:pPr>
+        <w:rPr>
+          <w:b/>
+          <w:bCs/>
+        </w:rPr>
+      </w:pPr>
+      <w:r>
+        <w:rPr>
+          <w:b/>
+          <w:bCs/>
+        </w:rPr>
+        <w:t>Durante la jornada de hoy se ha realizado una mejora integral del proyecto GR-Inn (</w:t>
+      </w:r>
+      <w:proofErr w:type="spellStart"/>
+      <w:r>
+        <w:rPr>
+          <w:b/>
+          <w:bCs/>
+        </w:rPr>
+        <w:t>eco_woods</w:t>
+      </w:r>
+      <w:proofErr w:type="spellEnd"/>
+      <w:r>
+        <w:rPr>
+          <w:b/>
+          <w:bCs/>
+        </w:rPr>
+        <w:t>) con un objetivo claro: dejar el sistema en un estado más sólido, seguro, mantenible y defendible de cara a la presentación final del TFG.</w:t>
+      </w:r>
+    </w:p>
+    <w:p>
+      <w:pPr>
+        <w:rPr>
+          <w:b/>
+          <w:bCs/>
+        </w:rPr>
+      </w:pPr>
+      <w:r>
+        <w:rPr>
+          <w:b/>
+          <w:bCs/>
+        </w:rPr>
+        <w:t>El trabajo no se ha centrado solo en “que funcione”, sino en que funcione bien, de forma consistente y con criterios profesionales.</w:t>
+      </w:r>
+    </w:p>
+    <w:p>
+      <w:pPr>
+        <w:rPr>
+          <w:b/>
+          <w:bCs/>
+        </w:rPr>
+      </w:pPr>
+      <w:r>
+        <w:rPr>
+          <w:b/>
+          <w:bCs/>
+        </w:rPr>
+        <w:t>Estado de partida y enfoque aplicado</w:t>
+      </w:r>
+    </w:p>
+    <w:p>
+      <w:pPr>
+        <w:rPr>
+          <w:b/>
+          <w:bCs/>
+        </w:rPr>
+      </w:pPr>
+      <w:r>
+        <w:rPr>
+          <w:b/>
+          <w:bCs/>
+        </w:rPr>
+        <w:t>Partíamos de un proyecto funcional, pero con margen de mejora en tres frentes clave: seguridad en consultas a base de datos, consistencia entre módulos y documentación interna del código para facilitar mantenimiento y defensa.</w:t>
+      </w:r>
+    </w:p>
+    <w:p>
+      <w:pPr>
+        <w:rPr>
+          <w:b/>
+          <w:bCs/>
+        </w:rPr>
+      </w:pPr>
+      <w:r>
+        <w:rPr>
+          <w:b/>
+          <w:bCs/>
+        </w:rPr>
+        <w:t>El trabajo se desarrolló en orden lógico, cerrando cada bloque antes de avanzar al siguiente y verificando en cada punto que no se rompía funcionalidad existente.</w:t>
+      </w:r>
+    </w:p>
+    <w:p>
+      <w:pPr>
+        <w:rPr>
+          <w:b/>
+          <w:bCs/>
+        </w:rPr>
+      </w:pPr>
+      <w:r>
+        <w:rPr>
+          <w:b/>
+          <w:bCs/>
+        </w:rPr>
+        <w:t xml:space="preserve">Refuerzo de seguridad y calidad en </w:t>
+      </w:r>
+      <w:proofErr w:type="spellStart"/>
+      <w:r>
+        <w:rPr>
+          <w:b/>
+          <w:bCs/>
+        </w:rPr>
+        <w:t>backend</w:t>
+      </w:r>
+      <w:proofErr w:type="spellEnd"/>
+    </w:p>
+    <w:p>
+      <w:pPr>
+        <w:rPr>
+          <w:b/>
+          <w:bCs/>
+        </w:rPr>
+      </w:pPr>
+      <w:r>
+        <w:rPr>
+          <w:b/>
+          <w:bCs/>
+        </w:rPr>
+        <w:t>Se revisaron y endurecieron puntos críticos del sistema para evitar comportamientos inseguros o errores por entradas mal formadas.</w:t>
+      </w:r>
+    </w:p>
+    <w:p>
+      <w:pPr>
+        <w:rPr>
+          <w:b/>
+          <w:bCs/>
+        </w:rPr>
+      </w:pPr>
+      <w:r>
+        <w:rPr>
+          <w:b/>
+          <w:bCs/>
+        </w:rPr>
+        <w:t xml:space="preserve">Se reforzó el control de acceso en rutas que requieren sesión, se consolidó la validación de peticiones POST con token CSRF en flujos web y se mejoró el control de entradas en </w:t>
+      </w:r>
+      <w:proofErr w:type="spellStart"/>
+      <w:r>
+        <w:rPr>
+          <w:b/>
+          <w:bCs/>
+        </w:rPr>
+        <w:t>endpoints</w:t>
+      </w:r>
+      <w:proofErr w:type="spellEnd"/>
+      <w:r>
+        <w:rPr>
+          <w:b/>
+          <w:bCs/>
+        </w:rPr>
+        <w:t xml:space="preserve"> sensibles (identificadores, permisos y propiedad de recursos). También se ajustaron respuestas de error para que sean más claras y homogéneas.</w:t>
+      </w:r>
+    </w:p>
+    <w:p>
+      <w:pPr>
+        <w:rPr>
+          <w:b/>
+          <w:bCs/>
+        </w:rPr>
+      </w:pPr>
+      <w:r>
+        <w:rPr>
+          <w:b/>
+          <w:bCs/>
+        </w:rPr>
+        <w:t>Este bloque es importante porque en una plataforma con publicaciones, carrito y mensajería, validar bien permisos y peticiones evita acciones no autorizadas y mejora la confianza del sistema.</w:t>
+      </w:r>
+    </w:p>
+    <w:p>
+      <w:pPr>
+        <w:rPr>
+          <w:b/>
+          <w:bCs/>
+        </w:rPr>
+      </w:pPr>
+      <w:r>
+        <w:rPr>
+          <w:b/>
+          <w:bCs/>
+        </w:rPr>
+        <w:t>Migración y saneamiento de consultas SQL</w:t>
+      </w:r>
+    </w:p>
+    <w:p>
+      <w:pPr>
+        <w:rPr>
+          <w:b/>
+          <w:bCs/>
+        </w:rPr>
+      </w:pPr>
+      <w:r>
+        <w:rPr>
+          <w:b/>
+          <w:bCs/>
+        </w:rPr>
+        <w:t>Uno de los trabajos más relevantes del día fue la migración amplia de consultas a un modelo más seguro con consultas preparadas.</w:t>
+      </w:r>
+    </w:p>
+    <w:p>
+      <w:pPr>
+        <w:rPr>
+          <w:b/>
+          <w:bCs/>
+        </w:rPr>
+      </w:pPr>
+      <w:r>
+        <w:rPr>
+          <w:b/>
+          <w:bCs/>
+        </w:rPr>
+        <w:t xml:space="preserve">Se aplicó en publicación de muebles y recambios, catálogo y búsqueda, detalle de productos, carrito, favoritos, reseñas, mensajería, finalización de compra, administración y </w:t>
+      </w:r>
+      <w:proofErr w:type="spellStart"/>
+      <w:r>
+        <w:rPr>
+          <w:b/>
+          <w:bCs/>
+        </w:rPr>
+        <w:t>endpoints</w:t>
+      </w:r>
+      <w:proofErr w:type="spellEnd"/>
+      <w:r>
+        <w:rPr>
+          <w:b/>
+          <w:bCs/>
+        </w:rPr>
+        <w:t xml:space="preserve"> API de lectura.</w:t>
+      </w:r>
+    </w:p>
+    <w:p>
+      <w:pPr>
+        <w:rPr>
+          <w:b/>
+          <w:bCs/>
+        </w:rPr>
+      </w:pPr>
+      <w:r>
+        <w:rPr>
+          <w:b/>
+          <w:bCs/>
+        </w:rPr>
+        <w:t>Además, en operaciones sensibles de borrado se incorporó control transaccional para no dejar datos “a medias” si algo falla durante la ejecución.</w:t>
+      </w:r>
+    </w:p>
+    <w:p>
+      <w:pPr>
+        <w:rPr>
+          <w:b/>
+          <w:bCs/>
+        </w:rPr>
+      </w:pPr>
+      <w:r>
+        <w:rPr>
+          <w:b/>
+          <w:bCs/>
+        </w:rPr>
+        <w:t>El resultado clave de hoy fue el cierre total de la deuda SQL residual. Incluso las comprobaciones de esquema que quedaban (</w:t>
+      </w:r>
+      <w:proofErr w:type="gramStart"/>
+      <w:r>
+        <w:rPr>
+          <w:b/>
+          <w:bCs/>
+        </w:rPr>
+        <w:t>SHOW</w:t>
+      </w:r>
+      <w:proofErr w:type="gramEnd"/>
+      <w:r>
+        <w:rPr>
+          <w:b/>
+          <w:bCs/>
+        </w:rPr>
+        <w:t xml:space="preserve"> COLUMNS y </w:t>
+      </w:r>
+      <w:proofErr w:type="gramStart"/>
+      <w:r>
+        <w:rPr>
+          <w:b/>
+          <w:bCs/>
+        </w:rPr>
+        <w:t>SHOW</w:t>
+      </w:r>
+      <w:proofErr w:type="gramEnd"/>
+      <w:r>
+        <w:rPr>
+          <w:b/>
+          <w:bCs/>
+        </w:rPr>
+        <w:t xml:space="preserve"> TABLES) se sustituyeron por comprobaciones seguras en INFORMATION_SCHEMA con consultas preparadas.</w:t>
+      </w:r>
+    </w:p>
+    <w:p>
+      <w:pPr>
+        <w:rPr>
+          <w:b/>
+          <w:bCs/>
+        </w:rPr>
+      </w:pPr>
+      <w:r>
+        <w:rPr>
+          <w:b/>
+          <w:bCs/>
+        </w:rPr>
+        <w:t>Validación reforzada de imágenes en publicación</w:t>
+      </w:r>
+    </w:p>
+    <w:p>
+      <w:pPr>
+        <w:rPr>
+          <w:b/>
+          <w:bCs/>
+        </w:rPr>
+      </w:pPr>
+      <w:r>
+        <w:rPr>
+          <w:b/>
+          <w:bCs/>
+        </w:rPr>
+        <w:t>Se mejoró el flujo de subida de imágenes en </w:t>
+      </w:r>
+      <w:proofErr w:type="spellStart"/>
+      <w:r>
+        <w:rPr>
+          <w:b/>
+          <w:bCs/>
+        </w:rPr>
+        <w:t>publicar.php</w:t>
+      </w:r>
+      <w:proofErr w:type="spellEnd"/>
+      <w:r>
+        <w:rPr>
+          <w:b/>
+          <w:bCs/>
+        </w:rPr>
+        <w:t> para reducir errores y riesgos.</w:t>
+      </w:r>
+    </w:p>
+    <w:p>
+      <w:pPr>
+        <w:rPr>
+          <w:b/>
+          <w:bCs/>
+        </w:rPr>
+      </w:pPr>
+      <w:r>
+        <w:rPr>
+          <w:b/>
+          <w:bCs/>
+        </w:rPr>
+        <w:t>Ahora se valida extensión permitida, tipo MIME real, tamaño máximo y que el archivo subido sea realmente una imagen. También se mejoró el tratamiento de errores para orientar mejor al usuario cuando un archivo no cumple condiciones.</w:t>
+      </w:r>
+    </w:p>
+    <w:p>
+      <w:pPr>
+        <w:rPr>
+          <w:b/>
+          <w:bCs/>
+        </w:rPr>
+      </w:pPr>
+      <w:r>
+        <w:rPr>
+          <w:b/>
+          <w:bCs/>
+        </w:rPr>
+        <w:lastRenderedPageBreak/>
+        <w:t>Esta mejora protege la plataforma en uno de los puntos más delicados de cualquier aplicación web: la subida de ficheros desde cliente.</w:t>
+      </w:r>
+    </w:p>
+    <w:p>
+      <w:pPr>
+        <w:rPr>
+          <w:b/>
+          <w:bCs/>
+        </w:rPr>
+      </w:pPr>
+      <w:r>
+        <w:rPr>
+          <w:b/>
+          <w:bCs/>
+        </w:rPr>
+        <w:t>Estabilización de módulos funcionales</w:t>
+      </w:r>
+    </w:p>
+    <w:p>
+      <w:pPr>
+        <w:rPr>
+          <w:b/>
+          <w:bCs/>
+        </w:rPr>
+      </w:pPr>
+      <w:r>
+        <w:rPr>
+          <w:b/>
+          <w:bCs/>
+        </w:rPr>
+        <w:t>Se consolidó el comportamiento de funcionalidades de uso diario para que trabajen de forma más estable y coherente entre sí.</w:t>
+      </w:r>
+    </w:p>
+    <w:p>
+      <w:pPr>
+        <w:rPr>
+          <w:b/>
+          <w:bCs/>
+        </w:rPr>
+      </w:pPr>
+      <w:r>
+        <w:rPr>
+          <w:b/>
+          <w:bCs/>
+        </w:rPr>
+        <w:t xml:space="preserve">Esto incluye carrito, favoritos, mensajería (envío, lectura, respuesta), detalle de muebles y recambios con reseñas, panel </w:t>
+      </w:r>
+      <w:proofErr w:type="spellStart"/>
+      <w:r>
+        <w:rPr>
+          <w:b/>
+          <w:bCs/>
+        </w:rPr>
+        <w:t>admin</w:t>
+      </w:r>
+      <w:proofErr w:type="spellEnd"/>
+      <w:r>
+        <w:rPr>
+          <w:b/>
+          <w:bCs/>
+        </w:rPr>
+        <w:t xml:space="preserve"> y consumo API. La mejora no solo es técnica, también impacta en la experiencia de uso y en la facilidad para hacer una demo limpia en defensa.</w:t>
+      </w:r>
+    </w:p>
+    <w:p>
+      <w:pPr>
+        <w:rPr>
+          <w:b/>
+          <w:bCs/>
+        </w:rPr>
+      </w:pPr>
+      <w:proofErr w:type="spellStart"/>
+      <w:r>
+        <w:rPr>
+          <w:b/>
+          <w:bCs/>
+        </w:rPr>
+        <w:t>Checklist</w:t>
+      </w:r>
+      <w:proofErr w:type="spellEnd"/>
+      <w:r>
+        <w:rPr>
+          <w:b/>
+          <w:bCs/>
+        </w:rPr>
+        <w:t xml:space="preserve"> de validación y cierre técnico</w:t>
+      </w:r>
+    </w:p>
+    <w:p>
+      <w:pPr>
+        <w:rPr>
+          <w:b/>
+          <w:bCs/>
+        </w:rPr>
+      </w:pPr>
+      <w:r>
+        <w:rPr>
+          <w:b/>
+          <w:bCs/>
+        </w:rPr>
+        <w:t>Se creó y actualizó el documento de control de cierre:</w:t>
+      </w:r>
+    </w:p>
+    <w:p>
+      <w:pPr>
+        <w:rPr>
+          <w:b/>
+          <w:bCs/>
+        </w:rPr>
+      </w:pPr>
+      <w:r>
+        <w:rPr>
+          <w:b/>
+          <w:bCs/>
+        </w:rPr>
+        <w:t>eco_woods/Documentacion/checklist_validacion_tfg_2026-03-03.md</w:t>
+      </w:r>
+    </w:p>
+    <w:p>
+      <w:pPr>
+        <w:rPr>
+          <w:b/>
+          <w:bCs/>
+        </w:rPr>
+      </w:pPr>
+      <w:r>
+        <w:rPr>
+          <w:b/>
+          <w:bCs/>
+        </w:rPr>
+        <w:t>Este documento recoge estado técnico, pruebas funcionales pendientes/realizadas y evidencias para memoria y defensa. También se actualizó para reflejar que la evidencia funcional puede documentarse sin necesidad obligatoria de capturas.</w:t>
+      </w:r>
+    </w:p>
+    <w:p>
+      <w:pPr>
+        <w:rPr>
+          <w:b/>
+          <w:bCs/>
+        </w:rPr>
+      </w:pPr>
+      <w:r>
+        <w:rPr>
+          <w:b/>
+          <w:bCs/>
+        </w:rPr>
+        <w:t>Documentación explicativa integrada en el código</w:t>
+      </w:r>
+    </w:p>
+    <w:p>
+      <w:pPr>
+        <w:rPr>
+          <w:b/>
+          <w:bCs/>
+        </w:rPr>
+      </w:pPr>
+      <w:r>
+        <w:rPr>
+          <w:b/>
+          <w:bCs/>
+        </w:rPr>
+        <w:t>Se añadió documentación interna en lenguaje comprensible en los archivos tratados durante esta etapa.</w:t>
+      </w:r>
+    </w:p>
+    <w:p>
+      <w:pPr>
+        <w:rPr>
+          <w:b/>
+          <w:bCs/>
+        </w:rPr>
+      </w:pPr>
+      <w:r>
+        <w:rPr>
+          <w:b/>
+          <w:bCs/>
+        </w:rPr>
+        <w:t>Se incorporó un bloque DOCUMENTACION_EXPLICATIVA_TFG en 32 archivos PHP, explicando qué hace cada archivo, por qué se decidió esa implementación y para qué sirve dentro del proyecto.</w:t>
+      </w:r>
+    </w:p>
+    <w:p>
+      <w:pPr>
+        <w:rPr>
+          <w:b/>
+          <w:bCs/>
+        </w:rPr>
+      </w:pPr>
+      <w:r>
+        <w:rPr>
+          <w:b/>
+          <w:bCs/>
+        </w:rPr>
+        <w:t>Esto facilita la defensa ante tribunal, porque permite justificar decisiones sin depender de explicaciones improvisadas o excesivamente técnicas.</w:t>
+      </w:r>
+    </w:p>
+    <w:p>
+      <w:pPr>
+        <w:rPr>
+          <w:b/>
+          <w:bCs/>
+        </w:rPr>
+      </w:pPr>
+      <w:r>
+        <w:rPr>
+          <w:b/>
+          <w:bCs/>
+        </w:rPr>
+        <w:t>Verificación técnica realizada hoy</w:t>
+      </w:r>
+    </w:p>
+    <w:p>
+      <w:pPr>
+        <w:rPr>
+          <w:b/>
+          <w:bCs/>
+        </w:rPr>
+      </w:pPr>
+      <w:r>
+        <w:rPr>
+          <w:b/>
+          <w:bCs/>
+        </w:rPr>
+        <w:t>Se validó sintaxis en los archivos modificados mediante php -l, sin errores.</w:t>
+      </w:r>
+    </w:p>
+    <w:p>
+      <w:pPr>
+        <w:rPr>
+          <w:b/>
+          <w:bCs/>
+        </w:rPr>
+      </w:pPr>
+      <w:r>
+        <w:rPr>
+          <w:b/>
+          <w:bCs/>
+        </w:rPr>
+        <w:t>También se pasó barrido de código para confirmar que, dentro del alcance tratado, no quedaban usos residuales de consultas inseguras en </w:t>
+      </w:r>
+      <w:proofErr w:type="spellStart"/>
+      <w:r>
+        <w:rPr>
+          <w:b/>
+          <w:bCs/>
+        </w:rPr>
+        <w:t>eco_woods</w:t>
+      </w:r>
+      <w:proofErr w:type="spellEnd"/>
+      <w:r>
+        <w:rPr>
+          <w:b/>
+          <w:bCs/>
+        </w:rPr>
+        <w:t>.</w:t>
+      </w:r>
+    </w:p>
+    <w:p>
+      <w:pPr>
+        <w:rPr>
+          <w:b/>
+          <w:bCs/>
+        </w:rPr>
+      </w:pPr>
+      <w:r>
+        <w:rPr>
+          <w:b/>
+          <w:bCs/>
+        </w:rPr>
+        <w:t>Conclusión del trabajo del día</w:t>
+      </w:r>
+    </w:p>
+    <w:p>
+      <w:pPr>
+        <w:rPr>
+          <w:b/>
+          <w:bCs/>
+        </w:rPr>
+      </w:pPr>
+      <w:r>
+        <w:rPr>
+          <w:b/>
+          <w:bCs/>
+        </w:rPr>
+        <w:t>El trabajo de hoy deja el TFG en un estado claramente más maduro: mejor seguridad, mayor consistencia funcional, menor deuda técnica y mejor base documental para presentación y defensa.</w:t>
+      </w:r>
+    </w:p>
+    <w:p>
+      <w:pPr>
+        <w:rPr>
+          <w:b/>
+          <w:bCs/>
+        </w:rPr>
+      </w:pPr>
+      <w:r>
+        <w:rPr>
+          <w:b/>
+          <w:bCs/>
+        </w:rPr>
+        <w:t>No solo se añadieron cambios de código; se reforzó la calidad global del proyecto y su capacidad de ser explicado y defendido con argumentos claros, concretos y entendibles.</w:t>
+      </w:r>
+    </w:p>
+    <w:p>
+      <w:pPr>
+        <w:rPr>
+          <w:b/>
+          <w:bCs/>
+        </w:rPr>
+      </w:pPr>
+    </w:p>
     <w:sectPr>
       <w:pgSz w:w="11906" w:h="16838"/>
       <w:pgMar w:top="1417" w:right="1701" w:bottom="1417" w:left="1701" w:header="708" w:footer="708" w:gutter="0"/>
@@ -439,7 +1118,6 @@
     <w:next w:val="Normal"/>
     <w:link w:val="Ttulo2Car"/>
     <w:uiPriority w:val="9"/>
-    <w:semiHidden/>
     <w:unhideWhenUsed/>
     <w:qFormat/>
     <w:rsid w:val="00625EEB"/>
@@ -614,7 +1292,6 @@
   <w:style w:type="character" w:default="1" w:styleId="Fuentedeprrafopredeter">
     <w:name w:val="Default Paragraph Font"/>
     <w:uiPriority w:val="1"/>
-    <w:semiHidden/>
     <w:unhideWhenUsed/>
   </w:style>
   <w:style w:type="table" w:default="1" w:styleId="Tablanormal">
@@ -656,7 +1333,6 @@
     <w:basedOn w:val="Fuentedeprrafopredeter"/>
     <w:link w:val="Ttulo2"/>
     <w:uiPriority w:val="9"/>
-    <w:semiHidden/>
     <w:rsid w:val="00625EEB"/>
     <w:rPr>
       <w:rFonts w:asciiTheme="majorHAnsi" w:eastAsiaTheme="majorEastAsia" w:hAnsiTheme="majorHAnsi" w:cstheme="majorBidi"/>

</xml_diff>